<commit_message>
move a metodologia completa atualizada para documentos e remove duplicatas soltas na raiz
</commit_message>
<xml_diff>
--- a/documentos/Metodologia_Completa.docx
+++ b/documentos/Metodologia_Completa.docx
@@ -17,43 +17,25 @@
           <w:sz w:val="21"/>
           <w:szCs w:val="21"/>
         </w:rPr>
-        <w:t xml:space="preserve">FUTURA EVIDENCE LAB · INSTITUTO AR / MÉDICOS PELO CLIMA</w:t>
-      </w:r>
-    </w:p>
-    <w:p>
-      <w:pPr>
-        <w:spacing w:after="120" w:line="276"/>
+        <w:t xml:space="preserve">METODOLOGIA COMPLETA</w:t>
+      </w:r>
+    </w:p>
+    <w:p>
+      <w:pPr>
+        <w:pStyle w:val="Heading1"/>
+        <w:keepNext/>
+        <w:spacing w:after="160" w:before="360"/>
       </w:pPr>
       <w:r>
         <w:rPr>
           <w:rFonts w:ascii="Calibri" w:cs="Calibri" w:eastAsia="Calibri" w:hAnsi="Calibri"/>
           <w:b/>
           <w:bCs/>
-          <w:i w:val="false"/>
-          <w:iCs w:val="false"/>
-          <w:color w:val="000000"/>
-          <w:sz w:val="21"/>
-          <w:szCs w:val="21"/>
-        </w:rPr>
-        <w:t xml:space="preserve">METODOLOGIA COMPLETA</w:t>
-      </w:r>
-    </w:p>
-    <w:p>
-      <w:pPr>
-        <w:spacing w:after="120" w:line="276"/>
-      </w:pPr>
-      <w:r>
-        <w:rPr>
-          <w:rFonts w:ascii="Calibri" w:cs="Calibri" w:eastAsia="Calibri" w:hAnsi="Calibri"/>
-          <w:b/>
-          <w:bCs/>
-          <w:i w:val="false"/>
-          <w:iCs w:val="false"/>
-          <w:color w:val="000000"/>
-          <w:sz w:val="21"/>
-          <w:szCs w:val="21"/>
-        </w:rPr>
-        <w:t xml:space="preserve">Clima e saúde nos planos de governo Eleições 2026</w:t>
+          <w:color w:val="026E81"/>
+          <w:sz w:val="30"/>
+          <w:szCs w:val="30"/>
+        </w:rPr>
+        <w:t xml:space="preserve">Clima e saúde nos planos de governo — Eleições 2026</w:t>
       </w:r>
     </w:p>
     <w:p>
@@ -89,43 +71,7 @@
           <w:sz w:val="21"/>
           <w:szCs w:val="21"/>
         </w:rPr>
-        <w:t xml:space="preserve">Salvador, 26 de setembro de 2026</w:t>
-      </w:r>
-    </w:p>
-    <w:p>
-      <w:pPr>
-        <w:spacing w:after="120" w:line="276"/>
-      </w:pPr>
-      <w:r>
-        <w:rPr>
-          <w:rFonts w:ascii="Calibri" w:cs="Calibri" w:eastAsia="Calibri" w:hAnsi="Calibri"/>
-          <w:b w:val="false"/>
-          <w:bCs w:val="false"/>
-          <w:i w:val="false"/>
-          <w:iCs w:val="false"/>
-          <w:color w:val="000000"/>
-          <w:sz w:val="21"/>
-          <w:szCs w:val="21"/>
-        </w:rPr>
-        <w:t xml:space="preserve">Clima e Saúde nos Planos de Governo — Eleições 2026</w:t>
-      </w:r>
-    </w:p>
-    <w:p>
-      <w:pPr>
-        <w:spacing w:after="120" w:line="276"/>
-      </w:pPr>
-      <w:r>
-        <w:rPr>
-          <w:rFonts w:ascii="Calibri" w:cs="Calibri" w:eastAsia="Calibri" w:hAnsi="Calibri"/>
-          <w:b w:val="false"/>
-          <w:bCs w:val="false"/>
-          <w:i w:val="false"/>
-          <w:iCs w:val="false"/>
-          <w:color w:val="000000"/>
-          <w:sz w:val="21"/>
-          <w:szCs w:val="21"/>
-        </w:rPr>
-        <w:t xml:space="preserve">Versão 5.0 — final · corpus fechado em 22/09/2026 · registro consolidado em 26/09/2026 · Futura Evidence Lab para Instituto Ar e Médicos pelo Clima</w:t>
+        <w:t xml:space="preserve">28 de setembro de 2026</w:t>
       </w:r>
     </w:p>
     <w:p>
@@ -202,7 +148,7 @@
           <w:sz w:val="21"/>
           <w:szCs w:val="21"/>
         </w:rPr>
-        <w:t xml:space="preserve">Este documento é a descrição técnica integral do método. Uma versão para o leitor não especialista, com a mesma estrutura, é a Nota metodológica v5.0; o enquadramento do projeto na legislação eleitoral está na Nota de defeso v4.0; os dados por disputa, na Nota metodológica segmentada. O dicionário de recuperação, o manifesto de arquivos com impressões digitais e o registro do plano incluído por emenda acompanham este documento.</w:t>
+        <w:t xml:space="preserve">Este documento é a descrição técnica integral do método. Uma versão para o leitor não especialista, com a mesma estrutura, é a Nota metodológica; o enquadramento do projeto na legislação eleitoral está na Nota de defeso; os dados por disputa, na Nota metodológica segmentada. O dicionário de recuperação, o manifesto de arquivos com impressões digitais e o registro do plano incluído por emenda acompanham este documento.</w:t>
       </w:r>
     </w:p>
     <w:tbl>
@@ -253,7 +199,7 @@
                 <w:sz w:val="20"/>
                 <w:szCs w:val="20"/>
               </w:rPr>
-              <w:t xml:space="preserve">34candidaturas</w:t>
+              <w:t xml:space="preserve">34 candidaturas</w:t>
             </w:r>
           </w:p>
         </w:tc>
@@ -283,7 +229,7 @@
                 <w:sz w:val="20"/>
                 <w:szCs w:val="20"/>
               </w:rPr>
-              <w:t xml:space="preserve">37arquivos PDF</w:t>
+              <w:t xml:space="preserve">37 arquivos PDF</w:t>
             </w:r>
           </w:p>
         </w:tc>
@@ -313,7 +259,7 @@
                 <w:sz w:val="20"/>
                 <w:szCs w:val="20"/>
               </w:rPr>
-              <w:t xml:space="preserve">2.319páginas</w:t>
+              <w:t xml:space="preserve">2.319 páginas</w:t>
             </w:r>
           </w:p>
         </w:tc>
@@ -343,7 +289,7 @@
                 <w:sz w:val="20"/>
                 <w:szCs w:val="20"/>
               </w:rPr>
-              <w:t xml:space="preserve">827trechos</w:t>
+              <w:t xml:space="preserve">815 trechos</w:t>
             </w:r>
           </w:p>
         </w:tc>
@@ -400,20 +346,25 @@
           <w:sz w:val="21"/>
           <w:szCs w:val="21"/>
         </w:rPr>
-        <w:t xml:space="preserve">Da Organização Mundial da Saúde (revisões de saúde nas NDCs, 2019 e 2023; critérios de qualidade, 2025) e da Global Climate and Health Alliance (Healthy NDC Scorecards, 2021 e 2023; Clean Air NDC Scorecard, 2023) vêm as famílias de categorias — governança integrada, impactos à saúde, ação do setor saúde, cobenefícios, financiamento, monitoramento — e a distinção, decisiva para este projeto, entre mencionar um tema e mencioná-lo de forma substantiva. Do Lancet Countdown (indicador 5.4, engajamento de governos) vem o modelo de detecção de menção presente ou ausente por documento. Do Climate Policy Radar e do Climate Change Laws of the World vem o padrão de vocabulário aberto e versionado, com changelog por conceito e validação de recall contra anotação manual. Do Manifesto Project (MARPOR) vêm a unidade de juízo por quase-sentença, o manual público e os testes de confiabilidade entre codificadores; do Comparative Agendas Project, o esquema hierárquico com regra de desempate; das tradições de pledge fulfillment, a exigência de que uma promessa seja testável. A estratégia de busca segue o checklist PRESS 2015: tradução da pergunta em blocos booleanos por conceito, recall medido contra padrão-ouro, testes de regressão a cada versão do dicionário.</w:t>
-      </w:r>
-      <w:r>
-        <w:rPr>
-          <w:rFonts w:ascii="Calibri" w:cs="Calibri" w:eastAsia="Calibri" w:hAnsi="Calibri"/>
-          <w:b w:val="false"/>
-          <w:bCs w:val="false"/>
-          <w:i w:val="false"/>
-          <w:iCs w:val="false"/>
-          <w:color w:val="000000"/>
-          <w:sz w:val="21"/>
-          <w:szCs w:val="21"/>
-        </w:rPr>
-        <w:t xml:space="preserve"> A quase-sentença permanece como unidade de juízo interpretativo — é sobre ela que o revisor decide tema e natureza —, mas a unidade registrada e publicada é o parágrafo do documento, como no Climate Policy Radar. As duas convivem: o juízo é feito na frase que motiva a classificação; o que se guarda e se mostra é o parágrafo que a contém.</w:t>
+        <w:t xml:space="preserve">Da Organização Mundial da Saúde (revisões de saúde nas NDCs, 2019 e 2023; critérios de qualidade, 2025) e da Global Climate and Health Alliance (Healthy NDC Scorecards, 2021 e 2023; Clean Air NDC Scorecard, 2023) vêm as famílias de categorias — governança integrada, impactos à saúde, ação do setor saúde, cobenefícios, financiamento, monitoramento — e a distinção, decisiva para este projeto, entre mencionar um tema e mencioná-lo de forma substantiva. Do Lancet Countdown (indicador 5.4, engajamento de governos) vem o modelo de detecção de menção presente ou ausente por documento. Do Climate Policy Radar e do Climate Change Laws of the World vem o padrão de vocabulário aberto e versionado, com changelog por conceito e validação de recall contra anotação manual. Do Manifesto Project (MARPOR) vêm a unidade de juízo por quase-sentença, o manual público e os testes de confiabilidade entre codificadores; do Comparative Agendas Project, o esquema hierárquico com regra de desempate; das tradições de pledge fulfillment, a exigência de que uma promessa seja testável.</w:t>
+      </w:r>
+    </w:p>
+    <w:p>
+      <w:pPr>
+        <w:spacing w:after="120" w:line="276"/>
+      </w:pPr>
+      <w:r>
+        <w:rPr>
+          <w:rFonts w:ascii="Calibri" w:cs="Calibri" w:eastAsia="Calibri" w:hAnsi="Calibri"/>
+          <w:b w:val="false"/>
+          <w:bCs w:val="false"/>
+          <w:i w:val="false"/>
+          <w:iCs w:val="false"/>
+          <w:color w:val="000000"/>
+          <w:sz w:val="21"/>
+          <w:szCs w:val="21"/>
+        </w:rPr>
+        <w:t xml:space="preserve">A estratégia de busca segue o checklist PRESS 2015: tradução da pergunta em blocos booleanos por conceito, recall medido contra padrão-ouro, testes de regressão a cada versão do dicionário. A quase-sentença permanece como unidade de juízo interpretativo — é sobre ela que o revisor decide tema e natureza —, mas a unidade registrada e publicada é o parágrafo do documento, como no Climate Policy Radar. As duas convivem: o juízo é feito na frase que motiva a classificação; o que se guarda e se mostra é o parágrafo que a contém.</w:t>
       </w:r>
     </w:p>
     <w:p>
@@ -750,25 +701,44 @@
           <w:sz w:val="21"/>
           <w:szCs w:val="21"/>
         </w:rPr>
-        <w:t xml:space="preserve"> A varredura desta edição usou a versão 3.2 (23 de setembro), com 192 entradas, e o dicionário publicado é a versão 3.3 (26 de setembro), que corrige conflitos de nível sem acrescentar nem retirar termos.</w:t>
-      </w:r>
-    </w:p>
-    <w:p>
-      <w:pPr>
-        <w:spacing w:after="120" w:line="276"/>
-      </w:pPr>
-      <w:r>
-        <w:rPr>
-          <w:rFonts w:ascii="Calibri" w:cs="Calibri" w:eastAsia="Calibri" w:hAnsi="Calibri"/>
-          <w:b w:val="false"/>
-          <w:bCs w:val="false"/>
-          <w:i w:val="false"/>
-          <w:iCs w:val="false"/>
-          <w:color w:val="000000"/>
-          <w:sz w:val="21"/>
-          <w:szCs w:val="21"/>
-        </w:rPr>
-        <w:t xml:space="preserve">Os termos têm quatro níveis. </w:t>
+        <w:t xml:space="preserve"> A varredura usou a versão 3.2 (23 de setembro), com 192 entradas, e o dicionário publicado é a versão 3.3 (26 de setembro), que corrige conflitos de nível sem acrescentar nem retirar termos.</w:t>
+      </w:r>
+    </w:p>
+    <w:p>
+      <w:pPr>
+        <w:spacing w:after="120" w:line="276"/>
+      </w:pPr>
+      <w:r>
+        <w:rPr>
+          <w:rFonts w:ascii="Calibri" w:cs="Calibri" w:eastAsia="Calibri" w:hAnsi="Calibri"/>
+          <w:b w:val="false"/>
+          <w:bCs w:val="false"/>
+          <w:i w:val="false"/>
+          <w:iCs w:val="false"/>
+          <w:color w:val="000000"/>
+          <w:sz w:val="21"/>
+          <w:szCs w:val="21"/>
+        </w:rPr>
+        <w:t xml:space="preserve">Os termos têm quatro níveis:</w:t>
+      </w:r>
+    </w:p>
+    <w:p>
+      <w:pPr>
+        <w:spacing w:after="120" w:line="276"/>
+        <w:ind w:left="340" w:hanging="170"/>
+      </w:pPr>
+      <w:r>
+        <w:rPr>
+          <w:rFonts w:ascii="Calibri" w:cs="Calibri" w:eastAsia="Calibri" w:hAnsi="Calibri"/>
+          <w:b w:val="false"/>
+          <w:bCs w:val="false"/>
+          <w:i w:val="false"/>
+          <w:iCs w:val="false"/>
+          <w:color w:val="000000"/>
+          <w:sz w:val="21"/>
+          <w:szCs w:val="21"/>
+        </w:rPr>
+        <w:t xml:space="preserve">•  </w:t>
       </w:r>
       <w:r>
         <w:rPr>
@@ -781,20 +751,39 @@
           <w:sz w:val="21"/>
           <w:szCs w:val="21"/>
         </w:rPr>
-        <w:t xml:space="preserve">Termo-gatilho:</w:t>
-      </w:r>
-      <w:r>
-        <w:rPr>
-          <w:rFonts w:ascii="Calibri" w:cs="Calibri" w:eastAsia="Calibri" w:hAnsi="Calibri"/>
-          <w:b w:val="false"/>
-          <w:bCs w:val="false"/>
-          <w:i w:val="false"/>
-          <w:iCs w:val="false"/>
-          <w:color w:val="000000"/>
-          <w:sz w:val="21"/>
-          <w:szCs w:val="21"/>
-        </w:rPr>
-        <w:t xml:space="preserve"> cria por si só um trecho candidato. </w:t>
+        <w:t xml:space="preserve">Termo-gatilho: </w:t>
+      </w:r>
+      <w:r>
+        <w:rPr>
+          <w:rFonts w:ascii="Calibri" w:cs="Calibri" w:eastAsia="Calibri" w:hAnsi="Calibri"/>
+          <w:b w:val="false"/>
+          <w:bCs w:val="false"/>
+          <w:i w:val="false"/>
+          <w:iCs w:val="false"/>
+          <w:color w:val="000000"/>
+          <w:sz w:val="21"/>
+          <w:szCs w:val="21"/>
+        </w:rPr>
+        <w:t xml:space="preserve">cria por si só um trecho candidato.</w:t>
+      </w:r>
+    </w:p>
+    <w:p>
+      <w:pPr>
+        <w:spacing w:after="120" w:line="276"/>
+        <w:ind w:left="340" w:hanging="170"/>
+      </w:pPr>
+      <w:r>
+        <w:rPr>
+          <w:rFonts w:ascii="Calibri" w:cs="Calibri" w:eastAsia="Calibri" w:hAnsi="Calibri"/>
+          <w:b w:val="false"/>
+          <w:bCs w:val="false"/>
+          <w:i w:val="false"/>
+          <w:iCs w:val="false"/>
+          <w:color w:val="000000"/>
+          <w:sz w:val="21"/>
+          <w:szCs w:val="21"/>
+        </w:rPr>
+        <w:t xml:space="preserve">•  </w:t>
       </w:r>
       <w:r>
         <w:rPr>
@@ -807,20 +796,39 @@
           <w:sz w:val="21"/>
           <w:szCs w:val="21"/>
         </w:rPr>
-        <w:t xml:space="preserve">Termo-objeto atribuível:</w:t>
-      </w:r>
-      <w:r>
-        <w:rPr>
-          <w:rFonts w:ascii="Calibri" w:cs="Calibri" w:eastAsia="Calibri" w:hAnsi="Calibri"/>
-          <w:b w:val="false"/>
-          <w:bCs w:val="false"/>
-          <w:i w:val="false"/>
-          <w:iCs w:val="false"/>
-          <w:color w:val="000000"/>
-          <w:sz w:val="21"/>
-          <w:szCs w:val="21"/>
-        </w:rPr>
-        <w:t xml:space="preserve"> nomeia um fenômeno reconhecido como climático por fonte pública; entra como candidato e é mantido quando o texto ou uma fonte externa citável faz o vínculo. </w:t>
+        <w:t xml:space="preserve">Termo-objeto atribuível: </w:t>
+      </w:r>
+      <w:r>
+        <w:rPr>
+          <w:rFonts w:ascii="Calibri" w:cs="Calibri" w:eastAsia="Calibri" w:hAnsi="Calibri"/>
+          <w:b w:val="false"/>
+          <w:bCs w:val="false"/>
+          <w:i w:val="false"/>
+          <w:iCs w:val="false"/>
+          <w:color w:val="000000"/>
+          <w:sz w:val="21"/>
+          <w:szCs w:val="21"/>
+        </w:rPr>
+        <w:t xml:space="preserve">nomeia um fenômeno reconhecido como climático por fonte pública; entra como candidato e é mantido quando o texto ou uma fonte externa citável faz o vínculo.</w:t>
+      </w:r>
+    </w:p>
+    <w:p>
+      <w:pPr>
+        <w:spacing w:after="120" w:line="276"/>
+        <w:ind w:left="340" w:hanging="170"/>
+      </w:pPr>
+      <w:r>
+        <w:rPr>
+          <w:rFonts w:ascii="Calibri" w:cs="Calibri" w:eastAsia="Calibri" w:hAnsi="Calibri"/>
+          <w:b w:val="false"/>
+          <w:bCs w:val="false"/>
+          <w:i w:val="false"/>
+          <w:iCs w:val="false"/>
+          <w:color w:val="000000"/>
+          <w:sz w:val="21"/>
+          <w:szCs w:val="21"/>
+        </w:rPr>
+        <w:t xml:space="preserve">•  </w:t>
       </w:r>
       <w:r>
         <w:rPr>
@@ -833,20 +841,39 @@
           <w:sz w:val="21"/>
           <w:szCs w:val="21"/>
         </w:rPr>
-        <w:t xml:space="preserve">Termo-objeto sem vínculo:</w:t>
-      </w:r>
-      <w:r>
-        <w:rPr>
-          <w:rFonts w:ascii="Calibri" w:cs="Calibri" w:eastAsia="Calibri" w:hAnsi="Calibri"/>
-          <w:b w:val="false"/>
-          <w:bCs w:val="false"/>
-          <w:i w:val="false"/>
-          <w:iCs w:val="false"/>
-          <w:color w:val="000000"/>
-          <w:sz w:val="21"/>
-          <w:szCs w:val="21"/>
-        </w:rPr>
-        <w:t xml:space="preserve"> nomeia um objeto de fronteira — desmatamento, saneamento, resíduos — que os planos usam também fora do clima; sozinho não indica trecho, e a menção fica registrada no perfil do plano, fora da matriz. </w:t>
+        <w:t xml:space="preserve">Termo-objeto sem vínculo: </w:t>
+      </w:r>
+      <w:r>
+        <w:rPr>
+          <w:rFonts w:ascii="Calibri" w:cs="Calibri" w:eastAsia="Calibri" w:hAnsi="Calibri"/>
+          <w:b w:val="false"/>
+          <w:bCs w:val="false"/>
+          <w:i w:val="false"/>
+          <w:iCs w:val="false"/>
+          <w:color w:val="000000"/>
+          <w:sz w:val="21"/>
+          <w:szCs w:val="21"/>
+        </w:rPr>
+        <w:t xml:space="preserve">nomeia um objeto de fronteira — desmatamento, saneamento, resíduos — que os planos usam também fora do clima; sozinho não indica trecho, e a menção fica registrada no perfil do plano, fora da matriz.</w:t>
+      </w:r>
+    </w:p>
+    <w:p>
+      <w:pPr>
+        <w:spacing w:after="120" w:line="276"/>
+        <w:ind w:left="340" w:hanging="170"/>
+      </w:pPr>
+      <w:r>
+        <w:rPr>
+          <w:rFonts w:ascii="Calibri" w:cs="Calibri" w:eastAsia="Calibri" w:hAnsi="Calibri"/>
+          <w:b w:val="false"/>
+          <w:bCs w:val="false"/>
+          <w:i w:val="false"/>
+          <w:iCs w:val="false"/>
+          <w:color w:val="000000"/>
+          <w:sz w:val="21"/>
+          <w:szCs w:val="21"/>
+        </w:rPr>
+        <w:t xml:space="preserve">•  </w:t>
       </w:r>
       <w:r>
         <w:rPr>
@@ -859,20 +886,38 @@
           <w:sz w:val="21"/>
           <w:szCs w:val="21"/>
         </w:rPr>
-        <w:t xml:space="preserve">Termo de contexto:</w:t>
-      </w:r>
-      <w:r>
-        <w:rPr>
-          <w:rFonts w:ascii="Calibri" w:cs="Calibri" w:eastAsia="Calibri" w:hAnsi="Calibri"/>
-          <w:b w:val="false"/>
-          <w:bCs w:val="false"/>
-          <w:i w:val="false"/>
-          <w:iCs w:val="false"/>
-          <w:color w:val="000000"/>
-          <w:sz w:val="21"/>
-          <w:szCs w:val="21"/>
-        </w:rPr>
-        <w:t xml:space="preserve"> não cria trecho; ajuda a decidir sobre um candidato já encontrado. Essa gradação impede que toda menção a saúde vire, automaticamente, uma menção a clima. Uma expressão de compromisso construída sobre um objeto sem vínculo — “desmatamento zero” — é termo-gatilho próprio e indica trecho.</w:t>
+        <w:t xml:space="preserve">Termo de contexto: </w:t>
+      </w:r>
+      <w:r>
+        <w:rPr>
+          <w:rFonts w:ascii="Calibri" w:cs="Calibri" w:eastAsia="Calibri" w:hAnsi="Calibri"/>
+          <w:b w:val="false"/>
+          <w:bCs w:val="false"/>
+          <w:i w:val="false"/>
+          <w:iCs w:val="false"/>
+          <w:color w:val="000000"/>
+          <w:sz w:val="21"/>
+          <w:szCs w:val="21"/>
+        </w:rPr>
+        <w:t xml:space="preserve">não cria trecho; ajuda a decidir sobre um candidato já encontrado.</w:t>
+      </w:r>
+    </w:p>
+    <w:p>
+      <w:pPr>
+        <w:spacing w:after="120" w:line="276"/>
+      </w:pPr>
+      <w:r>
+        <w:rPr>
+          <w:rFonts w:ascii="Calibri" w:cs="Calibri" w:eastAsia="Calibri" w:hAnsi="Calibri"/>
+          <w:b w:val="false"/>
+          <w:bCs w:val="false"/>
+          <w:i w:val="false"/>
+          <w:iCs w:val="false"/>
+          <w:color w:val="000000"/>
+          <w:sz w:val="21"/>
+          <w:szCs w:val="21"/>
+        </w:rPr>
+        <w:t xml:space="preserve">Essa gradação impede que toda menção a saúde vire, automaticamente, uma menção a clima. Uma expressão de compromisso construída sobre um objeto sem vínculo — “desmatamento zero” — é termo-gatilho próprio e indica trecho.</w:t>
       </w:r>
     </w:p>
     <w:p>
@@ -993,20 +1038,7 @@
           <w:sz w:val="21"/>
           <w:szCs w:val="21"/>
         </w:rPr>
-        <w:t xml:space="preserve">Conflitos de nível.</w:t>
-      </w:r>
-      <w:r>
-        <w:rPr>
-          <w:rFonts w:ascii="Calibri" w:cs="Calibri" w:eastAsia="Calibri" w:hAnsi="Calibri"/>
-          <w:b w:val="false"/>
-          <w:bCs w:val="false"/>
-          <w:i w:val="false"/>
-          <w:iCs w:val="false"/>
-          <w:color w:val="000000"/>
-          <w:sz w:val="21"/>
-          <w:szCs w:val="21"/>
-        </w:rPr>
-        <w:t xml:space="preserve"> Um termo não pode ser cabeça de uma entrada e variante de outra com nível diferente: qual dos dois vale passaria a depender da ordem de avaliação, que não é critério metodológico. A versão 3.3 resolve os três casos existentes — “desmatamento zero” e “desmatamento líquido” saem das variantes das duas entradas “desmatamento”; “incêndio florestal” sai das variantes de “queimadas” e de “incêndio” — e harmoniza as listas de variantes das duas entradas homônimas. Nenhuma das correções altera o conjunto dos 827 trechos, porque as entradas-gatilho já existiam e já haviam sido varridas.</w:t>
+        <w:t xml:space="preserve">Conflitos de nível. Um termo não pode ser cabeça de uma entrada e variante de outra com nível diferente: qual dos dois vale passaria a depender da ordem de avaliação, que não é critério metodológico. A versão 3.3 resolve os três casos existentes — “desmatamento zero” e “desmatamento líquido” saem das variantes das duas entradas “desmatamento”; “incêndio florestal” sai das variantes de “queimadas” e de “incêndio” — e harmoniza as listas de variantes das duas entradas homônimas. Nenhuma das correções altera o conjunto dos 815 trechos, porque as entradas-gatilho já existiam e já haviam sido varridas.</w:t>
       </w:r>
     </w:p>
     <w:p>
@@ -1042,25 +1074,25 @@
           <w:sz w:val="21"/>
           <w:szCs w:val="21"/>
         </w:rPr>
-        <w:t xml:space="preserve">Quatro temas comparáveis — mitigação climática, adaptação e eventos extremos, poluição do ar, impactos do clima na saúde — substituíram um desenho anterior de seis eixos: governança climática e ação do setor saúde deixaram de ser eixos da matriz comparativa, para manter os temas comparáveis entre disputas de competências institucionais tão diferentes. Seus trechos continuam registrados como camada própria, fora da contagem comparativa, e publicados no perfil de cada plano; a contagem de 51, feita no desenho anterior de seis eixos, não foi reconferida nesta edição e deixa de ser citada como número. Um trecho que nomeia o clima em termos gerais, sem vocabulário de adaptação e sem dano à saúde afirmado, é classificado em mitigação climática — regra aplicada desde a primeira rodada de classificação e agora declarada.</w:t>
-      </w:r>
-    </w:p>
-    <w:p>
-      <w:pPr>
-        <w:spacing w:after="120" w:line="276"/>
-      </w:pPr>
-      <w:r>
-        <w:rPr>
-          <w:rFonts w:ascii="Calibri" w:cs="Calibri" w:eastAsia="Calibri" w:hAnsi="Calibri"/>
-          <w:b w:val="false"/>
-          <w:bCs w:val="false"/>
-          <w:i w:val="false"/>
-          <w:iCs w:val="false"/>
-          <w:color w:val="000000"/>
-          <w:sz w:val="21"/>
-          <w:szCs w:val="21"/>
-        </w:rPr>
-        <w:t xml:space="preserve">Cada trecho candidato passa primeiro por um checklist de descarte com razão declarada: (a) homonímia — a palavra com outro sentido; (b) contexto não programático — sumário, título solto, legenda; (c) outro domínio — um deslizamento de rejeitos de mineração não é evento climático; (d) repetição — o trecho já registrado no mesmo documento. Mantido, recebe três atributos. Estatuto: Enunciado, quando o plano usa o vocabulário do próprio tema; Atribuível, quando trata de um objeto — enchente, seca, queimada, Defesa Civil em contexto de desastre — cujo vínculo com o tema vem de fonte pública nomeada, não da interpretação do leitor. Natureza, em quatro valores. Compromisso: o plano anuncia o que fará no futuro e o tema é um dos objetos da ação. Relato: o plano descreve uma situação, relata o que o governo atual já fez ou está fazendo, ou enuncia um princípio ou condição sem anunciar ação. Citação: o termo aparece, mas o trecho não afirma nada sobre ele. Contrário: o trecho nega ou contesta a mudança do clima ou a ação climática — a busca por linguagem contrária percorreu os 37 arquivos com uma lista de expressões publicada junto com o dicionário, nenhum trecho recebeu esta natureza, e o zero é reportado como resultado da busca. Nível de detalhamento: o nível mais alto é a meta quantificada — o trecho fixa um resultado a alcançar, expresso em número, percentual ou prazo verificável, inclusive zero, e esse resultado é o do tema pelo qual o trecho está registrado; um número que descreve a situação não é meta, e um alvo cujo resultado não pode ser verificado também não. Os demais atributos formais — orçamento, prazo isolado e referência a lei ou plano nomeado — existem na marcação interna e não são publicados nesta edição: duas contagens do mesmo atributo divergem e nenhuma passou por leitura humana.</w:t>
+        <w:t xml:space="preserve">Quatro temas comparáveis formam a matriz: mitigação climática, adaptação e eventos extremos, poluição do ar, impactos do clima na saúde. Duas categorias do quadro de referência — governança climática e ação do próprio setor saúde — não são temas da matriz, para manter a comparação entre disputas de competências institucionais tão diferentes; seus trechos são registrados como camada própria, fora da contagem comparativa, e publicados no perfil de cada plano. Um trecho que nomeia o clima em termos gerais, sem vocabulário de adaptação e sem dano à saúde afirmado, é classificado em mitigação climática.</w:t>
+      </w:r>
+    </w:p>
+    <w:p>
+      <w:pPr>
+        <w:spacing w:after="120" w:line="276"/>
+      </w:pPr>
+      <w:r>
+        <w:rPr>
+          <w:rFonts w:ascii="Calibri" w:cs="Calibri" w:eastAsia="Calibri" w:hAnsi="Calibri"/>
+          <w:b w:val="false"/>
+          <w:bCs w:val="false"/>
+          <w:i w:val="false"/>
+          <w:iCs w:val="false"/>
+          <w:color w:val="000000"/>
+          <w:sz w:val="21"/>
+          <w:szCs w:val="21"/>
+        </w:rPr>
+        <w:t xml:space="preserve">Cada trecho candidato passa primeiro por um checklist de descarte com razão declarada: homonímia (a palavra com outro sentido); contexto não programático (sumário, título solto, legenda); outro domínio (um deslizamento de rejeitos de mineração não é evento climático); repetição (o trecho já registrado no mesmo documento). Mantido, o trecho recebe três atributos.</w:t>
       </w:r>
     </w:p>
     <w:p>
@@ -1078,97 +1110,20 @@
           <w:sz w:val="21"/>
           <w:szCs w:val="21"/>
         </w:rPr>
-        <w:t xml:space="preserve">A regra de fronteira entre adaptação e impactos na saúde</w:t>
-      </w:r>
-    </w:p>
-    <w:p>
-      <w:pPr>
-        <w:spacing w:after="120" w:line="276"/>
-      </w:pPr>
-      <w:r>
-        <w:rPr>
-          <w:rFonts w:ascii="Calibri" w:cs="Calibri" w:eastAsia="Calibri" w:hAnsi="Calibri"/>
-          <w:b w:val="false"/>
-          <w:bCs w:val="false"/>
-          <w:i w:val="false"/>
-          <w:iCs w:val="false"/>
-          <w:color w:val="000000"/>
-          <w:sz w:val="21"/>
-          <w:szCs w:val="21"/>
-        </w:rPr>
-        <w:t xml:space="preserve">A redação anterior era mais larga do que a classificação efetivamente feita: bastava o trecho nomear dano humano ou termo de saúde. A redação final tem três cláusulas:</w:t>
-      </w:r>
-    </w:p>
-    <w:p>
-      <w:pPr>
-        <w:spacing w:after="120" w:line="276"/>
-      </w:pPr>
-      <w:r>
-        <w:rPr>
-          <w:rFonts w:ascii="Calibri" w:cs="Calibri" w:eastAsia="Calibri" w:hAnsi="Calibri"/>
-          <w:b w:val="false"/>
-          <w:bCs w:val="false"/>
-          <w:i w:val="false"/>
-          <w:iCs w:val="false"/>
-          <w:color w:val="000000"/>
-          <w:sz w:val="21"/>
-          <w:szCs w:val="21"/>
-        </w:rPr>
-        <w:t xml:space="preserve">(1) O tema é impactos do clima na saúde quando o dano à saúde humana — doença, morte, agravo, sobrecarga do sistema de saúde — é o objeto do enunciado, afirmado como ocorrência, consequência ou risco decorrente do clima, de evento extremo ou da poluição do ar.</w:t>
-      </w:r>
-    </w:p>
-    <w:p>
-      <w:pPr>
-        <w:spacing w:after="120" w:line="276"/>
-      </w:pPr>
-      <w:r>
-        <w:rPr>
-          <w:rFonts w:ascii="Calibri" w:cs="Calibri" w:eastAsia="Calibri" w:hAnsi="Calibri"/>
-          <w:b w:val="false"/>
-          <w:bCs w:val="false"/>
-          <w:i w:val="false"/>
-          <w:iCs w:val="false"/>
-          <w:color w:val="000000"/>
-          <w:sz w:val="21"/>
-          <w:szCs w:val="21"/>
-        </w:rPr>
-        <w:t xml:space="preserve">(2) Permanece em adaptação quando o objeto do enunciado é a ação de proteção e o dano humano aparece apenas como a perda que essa ação pretende evitar, ao lado de perdas materiais.</w:t>
-      </w:r>
-    </w:p>
-    <w:p>
-      <w:pPr>
-        <w:spacing w:after="120" w:line="276"/>
-      </w:pPr>
-      <w:r>
-        <w:rPr>
-          <w:rFonts w:ascii="Calibri" w:cs="Calibri" w:eastAsia="Calibri" w:hAnsi="Calibri"/>
-          <w:b w:val="false"/>
-          <w:bCs w:val="false"/>
-          <w:i w:val="false"/>
-          <w:iCs w:val="false"/>
-          <w:color w:val="000000"/>
-          <w:sz w:val="21"/>
-          <w:szCs w:val="21"/>
-        </w:rPr>
-        <w:t xml:space="preserve">(3) Termo de saúde usado como nome de setor, órgão, serviço ou finalidade de política, sem dano enunciado, não gera o tema.</w:t>
-      </w:r>
-    </w:p>
-    <w:p>
-      <w:pPr>
-        <w:spacing w:after="120" w:line="276"/>
-      </w:pPr>
-      <w:r>
-        <w:rPr>
-          <w:rFonts w:ascii="Calibri" w:cs="Calibri" w:eastAsia="Calibri" w:hAnsi="Calibri"/>
-          <w:b w:val="false"/>
-          <w:bCs w:val="false"/>
-          <w:i w:val="false"/>
-          <w:iCs w:val="false"/>
-          <w:color w:val="000000"/>
-          <w:sz w:val="21"/>
-          <w:szCs w:val="21"/>
-        </w:rPr>
-        <w:t xml:space="preserve">Três outras decisões de método, registradas com os casos afetados: relato de gestão em curso — trechos em que um plano de reeleição descreve o que o próprio governo já fez — continua contado como Relato, com atributo histórico visível (sem ele, o plano presidencial mais afetado cairia de 55 para 38 trechos); desmatamento permanece objeto sem vínculo, no perfil e fora da matriz (contado, acrescentaria dezenas de menções em quase todos os planos sem que o vínculo fosse feito pelo próprio plano); e a matriz de quatro temas, com os 51 trechos de governança e setor saúde preservados fora da contagem.</w:t>
+        <w:t xml:space="preserve">Estatuto. </w:t>
+      </w:r>
+      <w:r>
+        <w:rPr>
+          <w:rFonts w:ascii="Calibri" w:cs="Calibri" w:eastAsia="Calibri" w:hAnsi="Calibri"/>
+          <w:b w:val="false"/>
+          <w:bCs w:val="false"/>
+          <w:i w:val="false"/>
+          <w:iCs w:val="false"/>
+          <w:color w:val="000000"/>
+          <w:sz w:val="21"/>
+          <w:szCs w:val="21"/>
+        </w:rPr>
+        <w:t xml:space="preserve">Enunciado, quando o plano usa o vocabulário do próprio tema; Atribuível, quando trata de um objeto — enchente, seca, queimada, Defesa Civil em contexto de desastre — cujo vínculo com o tema vem de fonte pública nomeada, não da interpretação do leitor.</w:t>
       </w:r>
     </w:p>
     <w:p>
@@ -1186,26 +1141,40 @@
           <w:sz w:val="21"/>
           <w:szCs w:val="21"/>
         </w:rPr>
-        <w:t xml:space="preserve">A unidade registrada.</w:t>
-      </w:r>
-      <w:r>
-        <w:rPr>
-          <w:rFonts w:ascii="Calibri" w:cs="Calibri" w:eastAsia="Calibri" w:hAnsi="Calibri"/>
-          <w:b w:val="false"/>
-          <w:bCs w:val="false"/>
-          <w:i w:val="false"/>
-          <w:iCs w:val="false"/>
-          <w:color w:val="000000"/>
-          <w:sz w:val="21"/>
-          <w:szCs w:val="21"/>
-        </w:rPr>
-        <w:t xml:space="preserve"> Cada trecho é um parágrafo do plano, transcrito literalmente, com o termo do dicionário destacado. A busca localiza o termo; a unidade guardada é o parágrafo inteiro em que ele está, porque uma frase isolada frequentemente não se sustenta sozinha. O parágrafo é o bloco de layout do PDF, remontado quando atravessa a quebra de página. Cabeçalhos, rodapés, números de página e numeração de item não fazem parte do trecho; numeração de seção que integra um título permanece. Nada é acrescentado ao texto do plano: as únicas transformações são subtrativas, ou devolvem o que a extração havia perdido.</w:t>
-      </w:r>
-    </w:p>
-    <w:p>
-      <w:pPr>
-        <w:spacing w:after="120" w:line="276"/>
-      </w:pPr>
+        <w:t xml:space="preserve">Natureza, </w:t>
+      </w:r>
+      <w:r>
+        <w:rPr>
+          <w:rFonts w:ascii="Calibri" w:cs="Calibri" w:eastAsia="Calibri" w:hAnsi="Calibri"/>
+          <w:b w:val="false"/>
+          <w:bCs w:val="false"/>
+          <w:i w:val="false"/>
+          <w:iCs w:val="false"/>
+          <w:color w:val="000000"/>
+          <w:sz w:val="21"/>
+          <w:szCs w:val="21"/>
+        </w:rPr>
+        <w:t xml:space="preserve">em quatro valores:</w:t>
+      </w:r>
+    </w:p>
+    <w:p>
+      <w:pPr>
+        <w:spacing w:after="120" w:line="276"/>
+        <w:ind w:left="340" w:hanging="170"/>
+      </w:pPr>
+      <w:r>
+        <w:rPr>
+          <w:rFonts w:ascii="Calibri" w:cs="Calibri" w:eastAsia="Calibri" w:hAnsi="Calibri"/>
+          <w:b w:val="false"/>
+          <w:bCs w:val="false"/>
+          <w:i w:val="false"/>
+          <w:iCs w:val="false"/>
+          <w:color w:val="000000"/>
+          <w:sz w:val="21"/>
+          <w:szCs w:val="21"/>
+        </w:rPr>
+        <w:t xml:space="preserve">•  </w:t>
+      </w:r>
       <w:r>
         <w:rPr>
           <w:rFonts w:ascii="Calibri" w:cs="Calibri" w:eastAsia="Calibri" w:hAnsi="Calibri"/>
@@ -1217,20 +1186,343 @@
           <w:sz w:val="21"/>
           <w:szCs w:val="21"/>
         </w:rPr>
-        <w:t xml:space="preserve">A porta de identidade da ocorrência.</w:t>
-      </w:r>
-      <w:r>
-        <w:rPr>
-          <w:rFonts w:ascii="Calibri" w:cs="Calibri" w:eastAsia="Calibri" w:hAnsi="Calibri"/>
-          <w:b w:val="false"/>
-          <w:bCs w:val="false"/>
-          <w:i w:val="false"/>
-          <w:iCs w:val="false"/>
-          <w:color w:val="000000"/>
-          <w:sz w:val="21"/>
-          <w:szCs w:val="21"/>
-        </w:rPr>
-        <w:t xml:space="preserve"> A troca de unidade não pode mover o trecho para outra ocorrência do mesmo termo na mesma página, o que substituiria a evidência. O parágrafo reconstruído só substitui o texto registrado quando contém comprovadamente a mesma ocorrência, por um de três testes: o texto registrado está contido nele por inteiro; nove décimos do texto registrado estão nele; ou o contexto imediato gravado no registro se confirma nele com trinta caracteres ou mais. Dos 827 trechos, 791 têm parágrafo reconstruído e 36 mantêm o texto registrado: 28 por ocorrência não confirmada, três por corrupção de fonte no PDF do plano e cinco por o arquivo não estar disponível.</w:t>
+        <w:t xml:space="preserve">Compromisso: </w:t>
+      </w:r>
+      <w:r>
+        <w:rPr>
+          <w:rFonts w:ascii="Calibri" w:cs="Calibri" w:eastAsia="Calibri" w:hAnsi="Calibri"/>
+          <w:b w:val="false"/>
+          <w:bCs w:val="false"/>
+          <w:i w:val="false"/>
+          <w:iCs w:val="false"/>
+          <w:color w:val="000000"/>
+          <w:sz w:val="21"/>
+          <w:szCs w:val="21"/>
+        </w:rPr>
+        <w:t xml:space="preserve">o plano anuncia o que fará no futuro e o tema é um dos objetos da ação.</w:t>
+      </w:r>
+    </w:p>
+    <w:p>
+      <w:pPr>
+        <w:spacing w:after="120" w:line="276"/>
+        <w:ind w:left="340" w:hanging="170"/>
+      </w:pPr>
+      <w:r>
+        <w:rPr>
+          <w:rFonts w:ascii="Calibri" w:cs="Calibri" w:eastAsia="Calibri" w:hAnsi="Calibri"/>
+          <w:b w:val="false"/>
+          <w:bCs w:val="false"/>
+          <w:i w:val="false"/>
+          <w:iCs w:val="false"/>
+          <w:color w:val="000000"/>
+          <w:sz w:val="21"/>
+          <w:szCs w:val="21"/>
+        </w:rPr>
+        <w:t xml:space="preserve">•  </w:t>
+      </w:r>
+      <w:r>
+        <w:rPr>
+          <w:rFonts w:ascii="Calibri" w:cs="Calibri" w:eastAsia="Calibri" w:hAnsi="Calibri"/>
+          <w:b/>
+          <w:bCs/>
+          <w:i w:val="false"/>
+          <w:iCs w:val="false"/>
+          <w:color w:val="000000"/>
+          <w:sz w:val="21"/>
+          <w:szCs w:val="21"/>
+        </w:rPr>
+        <w:t xml:space="preserve">Relato: </w:t>
+      </w:r>
+      <w:r>
+        <w:rPr>
+          <w:rFonts w:ascii="Calibri" w:cs="Calibri" w:eastAsia="Calibri" w:hAnsi="Calibri"/>
+          <w:b w:val="false"/>
+          <w:bCs w:val="false"/>
+          <w:i w:val="false"/>
+          <w:iCs w:val="false"/>
+          <w:color w:val="000000"/>
+          <w:sz w:val="21"/>
+          <w:szCs w:val="21"/>
+        </w:rPr>
+        <w:t xml:space="preserve">o plano descreve uma situação, relata o que o governo atual já fez ou está fazendo, ou enuncia um princípio ou condição sem anunciar ação.</w:t>
+      </w:r>
+    </w:p>
+    <w:p>
+      <w:pPr>
+        <w:spacing w:after="120" w:line="276"/>
+        <w:ind w:left="340" w:hanging="170"/>
+      </w:pPr>
+      <w:r>
+        <w:rPr>
+          <w:rFonts w:ascii="Calibri" w:cs="Calibri" w:eastAsia="Calibri" w:hAnsi="Calibri"/>
+          <w:b w:val="false"/>
+          <w:bCs w:val="false"/>
+          <w:i w:val="false"/>
+          <w:iCs w:val="false"/>
+          <w:color w:val="000000"/>
+          <w:sz w:val="21"/>
+          <w:szCs w:val="21"/>
+        </w:rPr>
+        <w:t xml:space="preserve">•  </w:t>
+      </w:r>
+      <w:r>
+        <w:rPr>
+          <w:rFonts w:ascii="Calibri" w:cs="Calibri" w:eastAsia="Calibri" w:hAnsi="Calibri"/>
+          <w:b/>
+          <w:bCs/>
+          <w:i w:val="false"/>
+          <w:iCs w:val="false"/>
+          <w:color w:val="000000"/>
+          <w:sz w:val="21"/>
+          <w:szCs w:val="21"/>
+        </w:rPr>
+        <w:t xml:space="preserve">Citação: </w:t>
+      </w:r>
+      <w:r>
+        <w:rPr>
+          <w:rFonts w:ascii="Calibri" w:cs="Calibri" w:eastAsia="Calibri" w:hAnsi="Calibri"/>
+          <w:b w:val="false"/>
+          <w:bCs w:val="false"/>
+          <w:i w:val="false"/>
+          <w:iCs w:val="false"/>
+          <w:color w:val="000000"/>
+          <w:sz w:val="21"/>
+          <w:szCs w:val="21"/>
+        </w:rPr>
+        <w:t xml:space="preserve">o termo aparece, mas o trecho não afirma nada sobre ele.</w:t>
+      </w:r>
+    </w:p>
+    <w:p>
+      <w:pPr>
+        <w:spacing w:after="120" w:line="276"/>
+        <w:ind w:left="340" w:hanging="170"/>
+      </w:pPr>
+      <w:r>
+        <w:rPr>
+          <w:rFonts w:ascii="Calibri" w:cs="Calibri" w:eastAsia="Calibri" w:hAnsi="Calibri"/>
+          <w:b w:val="false"/>
+          <w:bCs w:val="false"/>
+          <w:i w:val="false"/>
+          <w:iCs w:val="false"/>
+          <w:color w:val="000000"/>
+          <w:sz w:val="21"/>
+          <w:szCs w:val="21"/>
+        </w:rPr>
+        <w:t xml:space="preserve">•  </w:t>
+      </w:r>
+      <w:r>
+        <w:rPr>
+          <w:rFonts w:ascii="Calibri" w:cs="Calibri" w:eastAsia="Calibri" w:hAnsi="Calibri"/>
+          <w:b/>
+          <w:bCs/>
+          <w:i w:val="false"/>
+          <w:iCs w:val="false"/>
+          <w:color w:val="000000"/>
+          <w:sz w:val="21"/>
+          <w:szCs w:val="21"/>
+        </w:rPr>
+        <w:t xml:space="preserve">Contrário: </w:t>
+      </w:r>
+      <w:r>
+        <w:rPr>
+          <w:rFonts w:ascii="Calibri" w:cs="Calibri" w:eastAsia="Calibri" w:hAnsi="Calibri"/>
+          <w:b w:val="false"/>
+          <w:bCs w:val="false"/>
+          <w:i w:val="false"/>
+          <w:iCs w:val="false"/>
+          <w:color w:val="000000"/>
+          <w:sz w:val="21"/>
+          <w:szCs w:val="21"/>
+        </w:rPr>
+        <w:t xml:space="preserve">o trecho nega ou contesta a mudança do clima ou a ação climática. A busca por linguagem contrária percorreu os 37 arquivos com uma lista de expressões publicada junto com o dicionário; nenhum trecho recebeu esta natureza, e o zero é reportado como resultado da busca.</w:t>
+      </w:r>
+    </w:p>
+    <w:p>
+      <w:pPr>
+        <w:spacing w:after="120" w:line="276"/>
+      </w:pPr>
+      <w:r>
+        <w:rPr>
+          <w:rFonts w:ascii="Calibri" w:cs="Calibri" w:eastAsia="Calibri" w:hAnsi="Calibri"/>
+          <w:b/>
+          <w:bCs/>
+          <w:i w:val="false"/>
+          <w:iCs w:val="false"/>
+          <w:color w:val="000000"/>
+          <w:sz w:val="21"/>
+          <w:szCs w:val="21"/>
+        </w:rPr>
+        <w:t xml:space="preserve">Nível de detalhamento. </w:t>
+      </w:r>
+      <w:r>
+        <w:rPr>
+          <w:rFonts w:ascii="Calibri" w:cs="Calibri" w:eastAsia="Calibri" w:hAnsi="Calibri"/>
+          <w:b w:val="false"/>
+          <w:bCs w:val="false"/>
+          <w:i w:val="false"/>
+          <w:iCs w:val="false"/>
+          <w:color w:val="000000"/>
+          <w:sz w:val="21"/>
+          <w:szCs w:val="21"/>
+        </w:rPr>
+        <w:t xml:space="preserve">O nível mais alto é a meta quantificada: o trecho fixa um resultado a alcançar, expresso em número, percentual ou prazo verificável, inclusive zero, e esse resultado é o do tema pelo qual o trecho está registrado. Um número que apenas descreve a situação não é meta, e um alvo cujo resultado não pode ser verificado também não. Os demais atributos formais — orçamento, prazo isolado e referência a lei ou plano nomeado — existem na marcação interna e não são publicados: as contagens internas divergem e nenhuma passou por leitura humana.</w:t>
+      </w:r>
+    </w:p>
+    <w:p>
+      <w:pPr>
+        <w:spacing w:after="120" w:line="276"/>
+      </w:pPr>
+      <w:r>
+        <w:rPr>
+          <w:rFonts w:ascii="Calibri" w:cs="Calibri" w:eastAsia="Calibri" w:hAnsi="Calibri"/>
+          <w:b/>
+          <w:bCs/>
+          <w:i w:val="false"/>
+          <w:iCs w:val="false"/>
+          <w:color w:val="000000"/>
+          <w:sz w:val="21"/>
+          <w:szCs w:val="21"/>
+        </w:rPr>
+        <w:t xml:space="preserve">A regra de fronteira entre adaptação e impactos na saúde</w:t>
+      </w:r>
+    </w:p>
+    <w:p>
+      <w:pPr>
+        <w:spacing w:after="120" w:line="276"/>
+      </w:pPr>
+      <w:r>
+        <w:rPr>
+          <w:rFonts w:ascii="Calibri" w:cs="Calibri" w:eastAsia="Calibri" w:hAnsi="Calibri"/>
+          <w:b w:val="false"/>
+          <w:bCs w:val="false"/>
+          <w:i w:val="false"/>
+          <w:iCs w:val="false"/>
+          <w:color w:val="000000"/>
+          <w:sz w:val="21"/>
+          <w:szCs w:val="21"/>
+        </w:rPr>
+        <w:t xml:space="preserve">A fronteira mais fina do esquema é decidida por três cláusulas:</w:t>
+      </w:r>
+    </w:p>
+    <w:p>
+      <w:pPr>
+        <w:spacing w:after="120" w:line="276"/>
+      </w:pPr>
+      <w:r>
+        <w:rPr>
+          <w:rFonts w:ascii="Calibri" w:cs="Calibri" w:eastAsia="Calibri" w:hAnsi="Calibri"/>
+          <w:b w:val="false"/>
+          <w:bCs w:val="false"/>
+          <w:i w:val="false"/>
+          <w:iCs w:val="false"/>
+          <w:color w:val="000000"/>
+          <w:sz w:val="21"/>
+          <w:szCs w:val="21"/>
+        </w:rPr>
+        <w:t xml:space="preserve">(1) O tema é impactos do clima na saúde quando o dano à saúde humana — doença, morte, agravo, sobrecarga do sistema de saúde — é o objeto do enunciado, afirmado como ocorrência, consequência ou risco decorrente do clima, de evento extremo ou da poluição do ar.</w:t>
+      </w:r>
+    </w:p>
+    <w:p>
+      <w:pPr>
+        <w:spacing w:after="120" w:line="276"/>
+      </w:pPr>
+      <w:r>
+        <w:rPr>
+          <w:rFonts w:ascii="Calibri" w:cs="Calibri" w:eastAsia="Calibri" w:hAnsi="Calibri"/>
+          <w:b w:val="false"/>
+          <w:bCs w:val="false"/>
+          <w:i w:val="false"/>
+          <w:iCs w:val="false"/>
+          <w:color w:val="000000"/>
+          <w:sz w:val="21"/>
+          <w:szCs w:val="21"/>
+        </w:rPr>
+        <w:t xml:space="preserve">(2) Permanece em adaptação quando o objeto do enunciado é a ação de proteção e o dano humano aparece apenas como a perda que essa ação pretende evitar, ao lado de perdas materiais.</w:t>
+      </w:r>
+    </w:p>
+    <w:p>
+      <w:pPr>
+        <w:spacing w:after="120" w:line="276"/>
+      </w:pPr>
+      <w:r>
+        <w:rPr>
+          <w:rFonts w:ascii="Calibri" w:cs="Calibri" w:eastAsia="Calibri" w:hAnsi="Calibri"/>
+          <w:b w:val="false"/>
+          <w:bCs w:val="false"/>
+          <w:i w:val="false"/>
+          <w:iCs w:val="false"/>
+          <w:color w:val="000000"/>
+          <w:sz w:val="21"/>
+          <w:szCs w:val="21"/>
+        </w:rPr>
+        <w:t xml:space="preserve">(3) Termo de saúde usado como nome de setor, órgão, serviço ou finalidade de política, sem dano enunciado, não gera o tema.</w:t>
+      </w:r>
+    </w:p>
+    <w:p>
+      <w:pPr>
+        <w:spacing w:after="120" w:line="276"/>
+      </w:pPr>
+      <w:r>
+        <w:rPr>
+          <w:rFonts w:ascii="Calibri" w:cs="Calibri" w:eastAsia="Calibri" w:hAnsi="Calibri"/>
+          <w:b w:val="false"/>
+          <w:bCs w:val="false"/>
+          <w:i w:val="false"/>
+          <w:iCs w:val="false"/>
+          <w:color w:val="000000"/>
+          <w:sz w:val="21"/>
+          <w:szCs w:val="21"/>
+        </w:rPr>
+        <w:t xml:space="preserve">Três outras decisões de método, registradas com os casos afetados: relato de gestão em curso — trechos em que um plano de reeleição descreve o que o próprio governo já fez — conta como Relato, com atributo histórico visível (sem ele, o plano presidencial mais afetado perderia dezessete trechos); desmatamento permanece objeto sem vínculo, no perfil e fora da matriz (contado, acrescentaria dezenas de menções em quase todos os planos sem que o vínculo fosse feito pelo próprio plano); e os trechos de governança climática e de ação do próprio setor saúde ficam registrados no perfil de cada plano, fora da matriz comparativa.</w:t>
+      </w:r>
+    </w:p>
+    <w:p>
+      <w:pPr>
+        <w:spacing w:after="120" w:line="276"/>
+      </w:pPr>
+      <w:r>
+        <w:rPr>
+          <w:rFonts w:ascii="Calibri" w:cs="Calibri" w:eastAsia="Calibri" w:hAnsi="Calibri"/>
+          <w:b/>
+          <w:bCs/>
+          <w:i w:val="false"/>
+          <w:iCs w:val="false"/>
+          <w:color w:val="000000"/>
+          <w:sz w:val="21"/>
+          <w:szCs w:val="21"/>
+        </w:rPr>
+        <w:t xml:space="preserve">A unidade registrada.</w:t>
+      </w:r>
+      <w:r>
+        <w:rPr>
+          <w:rFonts w:ascii="Calibri" w:cs="Calibri" w:eastAsia="Calibri" w:hAnsi="Calibri"/>
+          <w:b w:val="false"/>
+          <w:bCs w:val="false"/>
+          <w:i w:val="false"/>
+          <w:iCs w:val="false"/>
+          <w:color w:val="000000"/>
+          <w:sz w:val="21"/>
+          <w:szCs w:val="21"/>
+        </w:rPr>
+        <w:t xml:space="preserve"> Cada trecho é um parágrafo do plano, transcrito literalmente, com o termo do dicionário destacado. A busca localiza o termo; a unidade guardada é o parágrafo inteiro em que ele está, porque uma frase isolada frequentemente não se sustenta sozinha. O parágrafo é o bloco de layout do PDF, remontado quando atravessa a quebra de página. Cabeçalhos, rodapés, números de página e numeração de item não fazem parte do trecho; numeração de seção que integra um título permanece. Nada é acrescentado ao texto do plano: as únicas transformações são subtrativas, ou devolvem o que a extração havia perdido.</w:t>
+      </w:r>
+    </w:p>
+    <w:p>
+      <w:pPr>
+        <w:spacing w:after="120" w:line="276"/>
+      </w:pPr>
+      <w:r>
+        <w:rPr>
+          <w:rFonts w:ascii="Calibri" w:cs="Calibri" w:eastAsia="Calibri" w:hAnsi="Calibri"/>
+          <w:b/>
+          <w:bCs/>
+          <w:i w:val="false"/>
+          <w:iCs w:val="false"/>
+          <w:color w:val="000000"/>
+          <w:sz w:val="21"/>
+          <w:szCs w:val="21"/>
+        </w:rPr>
+        <w:t xml:space="preserve">A porta de identidade da ocorrência. A troca de unidade não pode mover o trecho para outra ocorrência do mesmo termo na mesma página, o que substituiria a evidência. O parágrafo reconstruído só substitui o texto registrado quando contém comprovadamente a mesma ocorrência, por um de três testes: o texto registrado está contido nele por inteiro; nove décimos do texto registrado estão nele; ou o contexto imediato gravado no registro se confirma nele com trinta caracteres ou mais. Dos 815 trechos, 780 têm parágrafo reconstruído e 35 mantêm o texto registrado: 27 por ocorrência não confirmada, cinco por corrupção de fonte no PDF do plano e três por o arquivo não estar disponível.</w:t>
       </w:r>
     </w:p>
     <w:p>
@@ -1284,25 +1576,25 @@
           <w:sz w:val="21"/>
           <w:szCs w:val="21"/>
         </w:rPr>
-        <w:t xml:space="preserve">A triagem separa o estável do ambíguo por autoconsenso em três rodadas. R1 é a pré-classificação original. R2 é uma rodada cega à R1, com os lotes embaralhados e instrução deliberadamente mais cética. R3 adjudica as divergências entre R1 e R2, vendo as duas leituras, com justificativa pelo manual e rótulo de divergência resolvida ou genuína. Um achado mudou o desenho antes da revisão humana: 162 das 175 divergências de decisão entre R1 e R2 eram descartes por duplicação — artefato do embaralhamento, não desacordo sobre conteúdo — e a deduplicação foi isolada como camada própria, por código.</w:t>
-      </w:r>
-    </w:p>
-    <w:p>
-      <w:pPr>
-        <w:spacing w:after="120" w:line="276"/>
-      </w:pPr>
-      <w:r>
-        <w:rPr>
-          <w:rFonts w:ascii="Calibri" w:cs="Calibri" w:eastAsia="Calibri" w:hAnsi="Calibri"/>
-          <w:b w:val="false"/>
-          <w:bCs w:val="false"/>
-          <w:i w:val="false"/>
-          <w:iCs w:val="false"/>
-          <w:color w:val="000000"/>
-          <w:sz w:val="21"/>
-          <w:szCs w:val="21"/>
-        </w:rPr>
-        <w:t xml:space="preserve">Concordância R1×R2, antes de retirar duplicados: 86% na decisão de manter ou descartar (kappa 0,60). Entre os itens mantidos pelas duas rodadas, o tema concorda em 97,6% (kappa 0,95, n = 874) — o campo mais estável. A natureza, entre os concordantes em tema, concorda em 93% — o campo mais frágil, sobretudo na fronteira entre Compromisso e Citação. O resultado, com a entrada direta dos itens da emenda de corpus e da expansão do dicionário, é a fila de leitura humana: 171 itens, estratificados por onde um erro mais mudaria o retrato publicado — as ambiguidades genuínas, a totalidade dos dois temas raros e amostras de controle das camadas automáticas.</w:t>
+        <w:t xml:space="preserve">A triagem separa o estável do ambíguo por três rodadas de classificação independentes. A primeira é a pré-classificação original. A segunda repete a classificação às cegas, sem acesso à primeira, com os lotes embaralhados e instrução deliberadamente mais cética. A terceira julga as divergências entre as duas, vendo as duas leituras, com justificativa pelo manual. Um achado mudou o desenho antes da revisão humana: 162 das 175 divergências de decisão entre as duas primeiras rodadas eram descartes por duplicação — artefato do embaralhamento, não desacordo sobre conteúdo — e a deduplicação foi isolada como etapa própria, por código.</w:t>
+      </w:r>
+    </w:p>
+    <w:p>
+      <w:pPr>
+        <w:spacing w:after="120" w:line="276"/>
+      </w:pPr>
+      <w:r>
+        <w:rPr>
+          <w:rFonts w:ascii="Calibri" w:cs="Calibri" w:eastAsia="Calibri" w:hAnsi="Calibri"/>
+          <w:b w:val="false"/>
+          <w:bCs w:val="false"/>
+          <w:i w:val="false"/>
+          <w:iCs w:val="false"/>
+          <w:color w:val="000000"/>
+          <w:sz w:val="21"/>
+          <w:szCs w:val="21"/>
+        </w:rPr>
+        <w:t xml:space="preserve">As duas rodadas independentes concordaram em 86% na decisão de manter ou descartar um candidato. Entre os itens mantidos pelas duas, o tema concorda em 97,6% — o atributo mais estável — e a natureza em 93% — o mais frágil, sobretudo na fronteira entre Compromisso e Citação. Desses resultados sai a fila de leitura humana: 171 itens, concentrados onde um erro mais mudaria o retrato publicado — as ambiguidades genuínas, a totalidade dos dois temas raros e amostras de controle das camadas estáveis.</w:t>
       </w:r>
     </w:p>
     <w:tbl>
@@ -2582,43 +2874,43 @@
           <w:sz w:val="21"/>
           <w:szCs w:val="21"/>
         </w:rPr>
-        <w:t xml:space="preserve">A fila foi lida e decidida por leitura humana, item a item, com justificativa escrita citando a regra aplicada: nenhuma reclassificação, nenhum descarte revertido. Poluição do ar e impactos do clima na saúde foram lidos integralmente; mitigação e adaptação, por amostra estratificada, com erro residual abaixo de 8% (regra de três, 95% de confiança). As citações dos itens lidos foram conferidas contra o texto dos PDFs originais: aparecem, palavra por palavra, na página citada. Essa conferência revelou dois arquivos com caracteres invisíveis dentro das palavras — hífen suave num plano maranhense, espaço de largura zero num plano gaúcho gerado por impressão de navegador —, que a rotina de extração passou a tratar.</w:t>
-      </w:r>
-    </w:p>
-    <w:p>
-      <w:pPr>
-        <w:spacing w:after="120" w:line="276"/>
-      </w:pPr>
-      <w:r>
-        <w:rPr>
-          <w:rFonts w:ascii="Calibri" w:cs="Calibri" w:eastAsia="Calibri" w:hAnsi="Calibri"/>
-          <w:b w:val="false"/>
-          <w:bCs w:val="false"/>
-          <w:i w:val="false"/>
-          <w:iCs w:val="false"/>
-          <w:color w:val="000000"/>
-          <w:sz w:val="21"/>
-          <w:szCs w:val="21"/>
-        </w:rPr>
-        <w:t xml:space="preserve">O total de itens lidos nas filas é 171. Item não é trecho: dos 171, 13 foram descartes ou ficaram fora dos quatro temas e não constam do registro; os 158 restantes são os trechos do registro com leitura humana individual.</w:t>
-      </w:r>
-    </w:p>
-    <w:p>
-      <w:pPr>
-        <w:spacing w:after="120" w:line="276"/>
-      </w:pPr>
-      <w:r>
-        <w:rPr>
-          <w:rFonts w:ascii="Calibri" w:cs="Calibri" w:eastAsia="Calibri" w:hAnsi="Calibri"/>
-          <w:b w:val="false"/>
-          <w:bCs w:val="false"/>
-          <w:i w:val="false"/>
-          <w:iCs w:val="false"/>
-          <w:color w:val="000000"/>
-          <w:sz w:val="21"/>
-          <w:szCs w:val="21"/>
-        </w:rPr>
-        <w:t xml:space="preserve">Sobre os 827 trechos do registro, o estado de verificação é: 158 lidos um a um por revisor humano, com decisão registrada; 668 verificados por amostra, sem correção nas amostras lidas — 530 com duas rodadas concordantes e 138 de rodada única ou confiança baixa; e um conferido contra o arquivo original, por ter entrado por variante de dicionário. Nos dois temas raros a cobertura é integral: os 18 trechos de impactos do clima na saúde e 15 dos 16 de poluição do ar foram lidos um a um, e o décimo sexto é o conferido contra o arquivo. A conferência final desta edição verificou, trecho a trecho, que nos 791 parágrafos reconstruídos o texto está integralmente presente na página de origem e que nos 827 o destaque aponta exatamente para a forma registrada.</w:t>
+        <w:t xml:space="preserve">A fila foi lida e decidida por leitura humana, item a item, com justificativa escrita citando a regra aplicada: nenhuma reclassificação, nenhum descarte revertido. Poluição do ar e impactos do clima na saúde foram lidos integralmente; mitigação e adaptação, por amostra estratificada, com erro residual abaixo de 8% (regra de três, 95% de confiança). As citações dos itens lidos foram conferidas contra o texto dos PDFs originais: aparecem, palavra por palavra, na página citada. Essa conferência revelou dois arquivos com caracteres invisíveis dentro das palavras — hífen suave num plano maranhense, espaço de largura zero num plano gaúcho gerado por impressão de navegador —, que a rotina de extração trata.</w:t>
+      </w:r>
+    </w:p>
+    <w:p>
+      <w:pPr>
+        <w:spacing w:after="120" w:line="276"/>
+      </w:pPr>
+      <w:r>
+        <w:rPr>
+          <w:rFonts w:ascii="Calibri" w:cs="Calibri" w:eastAsia="Calibri" w:hAnsi="Calibri"/>
+          <w:b w:val="false"/>
+          <w:bCs w:val="false"/>
+          <w:i w:val="false"/>
+          <w:iCs w:val="false"/>
+          <w:color w:val="000000"/>
+          <w:sz w:val="21"/>
+          <w:szCs w:val="21"/>
+        </w:rPr>
+        <w:t xml:space="preserve">O total de itens lidos nas filas é 171. Item não é trecho: dos 171, 15 não correspondem a trechos do registro — descartes, itens fora dos quatro temas e menções desconsideradas na validação — e os 156 restantes são os trechos do registro com leitura humana individual.</w:t>
+      </w:r>
+    </w:p>
+    <w:p>
+      <w:pPr>
+        <w:spacing w:after="120" w:line="276"/>
+      </w:pPr>
+      <w:r>
+        <w:rPr>
+          <w:rFonts w:ascii="Calibri" w:cs="Calibri" w:eastAsia="Calibri" w:hAnsi="Calibri"/>
+          <w:b w:val="false"/>
+          <w:bCs w:val="false"/>
+          <w:i w:val="false"/>
+          <w:iCs w:val="false"/>
+          <w:color w:val="000000"/>
+          <w:sz w:val="21"/>
+          <w:szCs w:val="21"/>
+        </w:rPr>
+        <w:t xml:space="preserve">Sobre os 815 trechos do registro, o estado de verificação é: 156 lidos um a um por revisor humano, com decisão registrada; 658 verificados por amostra, sem correção nas amostras lidas — 523 com duas rodadas concordantes e 135 de rodada única ou confiança baixa; e um conferido contra o arquivo original, por ter entrado por variante de dicionário. Nos dois temas raros a cobertura é integral: os 18 trechos de impactos do clima na saúde e 15 dos 16 de poluição do ar foram lidos um a um, e o décimo sexto é o conferido contra o arquivo. A conferência final verificou, trecho a trecho, que o texto exibido está presente na página de origem — nos três trechos extraídos de tabelas, a transcrição não preserva a formatação de colunas, o que está anotado na base — e que, em todos, o destaque aponta exatamente para a forma registrada.</w:t>
       </w:r>
     </w:p>
     <w:p>
@@ -2636,7 +2928,7 @@
           <w:sz w:val="21"/>
           <w:szCs w:val="21"/>
         </w:rPr>
-        <w:t xml:space="preserve">3.6 Três achados de auditoria</w:t>
+        <w:t xml:space="preserve">3.6 Fronteiras e repetições</w:t>
       </w:r>
     </w:p>
     <w:p>
@@ -2654,20 +2946,20 @@
           <w:sz w:val="21"/>
           <w:szCs w:val="21"/>
         </w:rPr>
-        <w:t xml:space="preserve">A fronteira estava mal escrita, mas a prática já a aplicava corretamente. </w:t>
-      </w:r>
-      <w:r>
-        <w:rPr>
-          <w:rFonts w:ascii="Calibri" w:cs="Calibri" w:eastAsia="Calibri" w:hAnsi="Calibri"/>
-          <w:b w:val="false"/>
-          <w:bCs w:val="false"/>
-          <w:i w:val="false"/>
-          <w:iCs w:val="false"/>
-          <w:color w:val="000000"/>
-          <w:sz w:val="21"/>
-          <w:szCs w:val="21"/>
-        </w:rPr>
-        <w:t xml:space="preserve">Uma varredura do registro completo encontrou 11 trechos fora do tema de impactos na saúde com vocabulário de dano humano; cinco não eram fronteira real (saúde animal, “vítimas” em sentido patrimonial); seis eram genuinamente ambíguos sob a regra então escrita — por exemplo “reduzir perdas humanas e econômicas” em adaptação, ao lado de “perdas humanas e econômicas por desastres” em impactos na saúde. A regra de três cláusulas (3.4) foi depois aplicada ao registro completo: dois dos 20 trechos então classificados em impactos do clima na saúde não satisfazem a segunda cláusula e passaram para adaptação — o do PSD na Presidência (p. 49) e o do PL no Rio Grande do Sul (p. 13), ambos com o objeto na preparação do serviço e não no dano à saúde. O tema passa a ter 18 trechos, nos mesmos nove planos.</w:t>
+        <w:t xml:space="preserve">A fronteira entre adaptação e impactos do clima na saúde é a mais fina do esquema. </w:t>
+      </w:r>
+      <w:r>
+        <w:rPr>
+          <w:rFonts w:ascii="Calibri" w:cs="Calibri" w:eastAsia="Calibri" w:hAnsi="Calibri"/>
+          <w:b w:val="false"/>
+          <w:bCs w:val="false"/>
+          <w:i w:val="false"/>
+          <w:iCs w:val="false"/>
+          <w:color w:val="000000"/>
+          <w:sz w:val="21"/>
+          <w:szCs w:val="21"/>
+        </w:rPr>
+        <w:t xml:space="preserve">Vocabulário de dano humano, sozinho, não define o tema: “vítimas” em sentido patrimonial e saúde animal ficam fora, e “reduzir perdas humanas e econômicas” pode ser preparação para o desastre, enquanto “perdas humanas e econômicas por desastres” pode ter o dano à saúde como objeto. A regra de três cláusulas (3.4) decide pelo objeto do trecho, aplicada ao registro completo: dois trechos com o objeto na preparação do serviço, e não no dano à saúde — o do PSD na Presidência (p. 49) e o do PL no Rio Grande do Sul (p. 13) —, estão em adaptação, e o tema de impactos do clima na saúde tem 18 trechos, em nove planos.</w:t>
       </w:r>
     </w:p>
     <w:p>
@@ -2685,51 +2977,20 @@
           <w:sz w:val="21"/>
           <w:szCs w:val="21"/>
         </w:rPr>
-        <w:t xml:space="preserve">A deduplicação estava certa; a documentação é que estava incompleta. </w:t>
-      </w:r>
-      <w:r>
-        <w:rPr>
-          <w:rFonts w:ascii="Calibri" w:cs="Calibri" w:eastAsia="Calibri" w:hAnsi="Calibri"/>
-          <w:b w:val="false"/>
-          <w:bCs w:val="false"/>
-          <w:i w:val="false"/>
-          <w:iCs w:val="false"/>
-          <w:color w:val="000000"/>
-          <w:sz w:val="21"/>
-          <w:szCs w:val="21"/>
-        </w:rPr>
-        <w:t xml:space="preserve">Dos 252 descartes por repetição, todos os 252 têm trecho correspondente mantido: 159 por sobreposição de janela na mesma página (dois termos acertando a mesma passagem) e 93 por repetição de um bloco em outra página do mesmo plano — num caso, o mesmo parágrafo em nove páginas de um plano estadual. Nada foi perdido; a consequência prática, agora declarada ao público, é que a página indicada é onde a passagem aparece, não necessariamente a única página em que aparece.</w:t>
-      </w:r>
-    </w:p>
-    <w:p>
-      <w:pPr>
-        <w:spacing w:after="120" w:line="276"/>
-      </w:pPr>
-      <w:r>
-        <w:rPr>
-          <w:rFonts w:ascii="Calibri" w:cs="Calibri" w:eastAsia="Calibri" w:hAnsi="Calibri"/>
-          <w:b/>
-          <w:bCs/>
-          <w:i w:val="false"/>
-          <w:iCs w:val="false"/>
-          <w:color w:val="000000"/>
-          <w:sz w:val="21"/>
-          <w:szCs w:val="21"/>
-        </w:rPr>
-        <w:t xml:space="preserve">Contagens corrigidas em versões preliminares. </w:t>
-      </w:r>
-      <w:r>
-        <w:rPr>
-          <w:rFonts w:ascii="Calibri" w:cs="Calibri" w:eastAsia="Calibri" w:hAnsi="Calibri"/>
-          <w:b w:val="false"/>
-          <w:bCs w:val="false"/>
-          <w:i w:val="false"/>
-          <w:iCs w:val="false"/>
-          <w:color w:val="000000"/>
-          <w:sz w:val="21"/>
-          <w:szCs w:val="21"/>
-        </w:rPr>
-        <w:t xml:space="preserve">Versões anteriores afirmavam três planos presidenciais sem identificação (eram dois, depois identificados por protocolo), atribuíam a diferença entre arquivos e candidaturas ao documento do PCO (a causa é a duplicata maranhense), e contavam 44 termos do dicionário sem ocorrência por critério não documentado — o critério explícito desta versão, reproduzível a partir do dicionário público, dá 39. A conferência termo a termo em qualquer grafia, feita em 26 de setembro, dá 41 — MonitorAr e PRODES entram na lista; Cemaden, VIGIÁGUA e VIGIAR estavam corretamente fora, com grafia que o script não reconhecia —, e 41 é o número publicado nesta edição, com as duas apurações lado a lado no dicionário.</w:t>
+        <w:t xml:space="preserve">Repetições dentro do mesmo plano. </w:t>
+      </w:r>
+      <w:r>
+        <w:rPr>
+          <w:rFonts w:ascii="Calibri" w:cs="Calibri" w:eastAsia="Calibri" w:hAnsi="Calibri"/>
+          <w:b w:val="false"/>
+          <w:bCs w:val="false"/>
+          <w:i w:val="false"/>
+          <w:iCs w:val="false"/>
+          <w:color w:val="000000"/>
+          <w:sz w:val="21"/>
+          <w:szCs w:val="21"/>
+        </w:rPr>
+        <w:t xml:space="preserve">Dos 252 descartes por repetição, todos os 252 têm trecho correspondente mantido: 159 por sobreposição de janela na mesma página — dois termos acertando a mesma passagem — e 93 por repetição de um bloco em outra página do mesmo plano; num caso, o mesmo parágrafo aparece em nove páginas de um plano estadual. A consequência prática é que a página indicada é onde a passagem aparece, não necessariamente a única página em que aparece.</w:t>
       </w:r>
     </w:p>
     <w:p>
@@ -4898,7 +5159,7 @@
           <w:sz w:val="21"/>
           <w:szCs w:val="21"/>
         </w:rPr>
-        <w:t xml:space="preserve">O registro tem 827 trechos nos quatro temas, cada um com página, citação literal do parágrafo e impressão digital (código SHA-256) do arquivo de origem. Vinte e sete dos 34 planos tocam ao menos um tema; sete não tocam nenhum — dois na Presidência, um no Rio Grande do Sul, um em São Paulo, três no Maranhão. Quatro planos tocam os quatro: PSD e UP na Presidência, PCB em São Paulo, PSTU no Maranhão.</w:t>
+        <w:t xml:space="preserve">O registro tem 815 trechos nos quatro temas, cada um com página, citação literal do parágrafo e impressão digital (código SHA-256) do arquivo de origem. Vinte e sete dos 34 planos tocam ao menos um tema; sete não tocam nenhum — dois na Presidência, um no Rio Grande do Sul, um em São Paulo, três no Maranhão. Quatro planos tocam os quatro: PSD e UP na Presidência, PCB em São Paulo, PSTU no Maranhão.</w:t>
       </w:r>
     </w:p>
     <w:p>
@@ -5073,7 +5334,7 @@
                 <w:sz w:val="20"/>
                 <w:szCs w:val="20"/>
               </w:rPr>
-              <w:t xml:space="preserve">560</w:t>
+              <w:t xml:space="preserve">555</w:t>
             </w:r>
           </w:p>
         </w:tc>
@@ -5162,7 +5423,7 @@
                 <w:sz w:val="20"/>
                 <w:szCs w:val="20"/>
               </w:rPr>
-              <w:t xml:space="preserve">233</w:t>
+              <w:t xml:space="preserve">226</w:t>
             </w:r>
           </w:p>
         </w:tc>
@@ -5429,7 +5690,7 @@
                 <w:sz w:val="20"/>
                 <w:szCs w:val="20"/>
               </w:rPr>
-              <w:t xml:space="preserve">827</w:t>
+              <w:t xml:space="preserve">815</w:t>
             </w:r>
           </w:p>
         </w:tc>
@@ -5760,7 +6021,7 @@
                 <w:sz w:val="20"/>
                 <w:szCs w:val="20"/>
               </w:rPr>
-              <w:t xml:space="preserve">219</w:t>
+              <w:t xml:space="preserve">209</w:t>
             </w:r>
           </w:p>
         </w:tc>
@@ -5789,7 +6050,7 @@
                 <w:sz w:val="20"/>
                 <w:szCs w:val="20"/>
               </w:rPr>
-              <w:t xml:space="preserve">107</w:t>
+              <w:t xml:space="preserve">103</w:t>
             </w:r>
           </w:p>
         </w:tc>
@@ -5818,7 +6079,7 @@
                 <w:sz w:val="20"/>
                 <w:szCs w:val="20"/>
               </w:rPr>
-              <w:t xml:space="preserve">100</w:t>
+              <w:t xml:space="preserve">94</w:t>
             </w:r>
           </w:p>
         </w:tc>
@@ -5965,7 +6226,7 @@
                 <w:sz w:val="20"/>
                 <w:szCs w:val="20"/>
               </w:rPr>
-              <w:t xml:space="preserve">389</w:t>
+              <w:t xml:space="preserve">388</w:t>
             </w:r>
           </w:p>
         </w:tc>
@@ -5994,7 +6255,7 @@
                 <w:sz w:val="20"/>
                 <w:szCs w:val="20"/>
               </w:rPr>
-              <w:t xml:space="preserve">326</w:t>
+              <w:t xml:space="preserve">325</w:t>
             </w:r>
           </w:p>
         </w:tc>
@@ -6170,7 +6431,7 @@
                 <w:sz w:val="20"/>
                 <w:szCs w:val="20"/>
               </w:rPr>
-              <w:t xml:space="preserve">114</w:t>
+              <w:t xml:space="preserve">113</w:t>
             </w:r>
           </w:p>
         </w:tc>
@@ -6228,7 +6489,7 @@
                 <w:sz w:val="20"/>
                 <w:szCs w:val="20"/>
               </w:rPr>
-              <w:t xml:space="preserve">34</w:t>
+              <w:t xml:space="preserve">33</w:t>
             </w:r>
           </w:p>
         </w:tc>
@@ -6580,7 +6841,7 @@
                 <w:sz w:val="20"/>
                 <w:szCs w:val="20"/>
               </w:rPr>
-              <w:t xml:space="preserve">827</w:t>
+              <w:t xml:space="preserve">815</w:t>
             </w:r>
           </w:p>
         </w:tc>
@@ -6609,7 +6870,7 @@
                 <w:sz w:val="20"/>
                 <w:szCs w:val="20"/>
               </w:rPr>
-              <w:t xml:space="preserve">560</w:t>
+              <w:t xml:space="preserve">555</w:t>
             </w:r>
           </w:p>
         </w:tc>
@@ -6638,7 +6899,7 @@
                 <w:sz w:val="20"/>
                 <w:szCs w:val="20"/>
               </w:rPr>
-              <w:t xml:space="preserve">233</w:t>
+              <w:t xml:space="preserve">226</w:t>
             </w:r>
           </w:p>
         </w:tc>
@@ -6746,7 +7007,7 @@
           <w:sz w:val="21"/>
           <w:szCs w:val="21"/>
         </w:rPr>
-        <w:t xml:space="preserve">Adaptação aparece em todo plano que fala de clima; mitigação vem depois, e sempre dentro de planos que já tratam de adaptação — não há plano com mitigação sem adaptação. Poluição do ar e impactos do clima na saúde quase não entram: 16 e 18 trechos, em 7 e 9 planos. O Rio Grande do Sul concentra a adaptação, com 326 trechos, quase todos ligados às enchentes de 2024. Dos 827 trechos, 472 são Compromissos, 255 são Relatos e 100 são Citações; nenhum é Contrário. Seis trechos, em quatro planos, fixam meta com número, percentual ou prazo verificável — três em mitigação e três em adaptação, nenhum em poluição do ar ou na relação entre clima e saúde. Quarenta e um dos 192 termos do dicionário — entre eles material particulado, MP2,5 e poluentes climáticos de vida curta — não aparecem em nenhuma das 2.319 páginas.</w:t>
+        <w:t xml:space="preserve">Adaptação aparece em todo plano que fala de clima; mitigação vem depois, e sempre dentro de planos que já tratam de adaptação — não há plano com mitigação sem adaptação. Poluição do ar e impactos do clima na saúde quase não entram: 16 e 18 trechos, em 7 e 9 planos. O Rio Grande do Sul concentra a adaptação, com 325 trechos, quase todos ligados às enchentes de 2024. Dos 815 trechos, 467 são Compromissos, 255 são Relatos e 93 são Citações; nenhum é Contrário. Seis trechos, em quatro planos, fixam meta com número, percentual ou prazo verificável — três em mitigação e três em adaptação, nenhum em poluição do ar ou na relação entre clima e saúde. Quarenta e um dos 192 termos do dicionário — entre eles material particulado, MP2,5 e poluentes climáticos de vida curta — não aparecem em nenhuma das 2.319 páginas.</w:t>
       </w:r>
     </w:p>
     <w:p>
@@ -6796,7 +7057,7 @@
           <w:sz w:val="21"/>
           <w:szCs w:val="21"/>
         </w:rPr>
-        <w:t xml:space="preserve">Um único revisor humano. É a validação item a item que o manual exige, com justificativa escrita: 171 itens lidos, com decisão registrada em todos e nenhuma revertida, correspondentes a 158 dos 827 trechos do registro. Com um único leitor e nenhuma discordância registrada não se calcula coeficiente de confiabilidade entre codificadores (uma das distribuições fica degenerada); o que se publica é a concordância bruta e a cobertura da leitura. A checagem cega por segundo codificador — 60 itens sorteados entre os itens lidos detectam uma taxa real de discordância de 5% com 95% de probabilidade — fica registrada como extensão possível, fora do escopo desta edição.</w:t>
+        <w:t xml:space="preserve">Mesmo manual usado para classificar e para revisar. Desenho adequado para medir consistência entre rodadas, insuficiente para descobrir sozinho que uma regra está mal redigida — foi uma auditoria separada da redação que encontrou a regra de fronteira entre adaptação e impactos na saúde (seção 3.4).</w:t>
       </w:r>
     </w:p>
     <w:p>
@@ -6828,7 +7089,7 @@
           <w:sz w:val="21"/>
           <w:szCs w:val="21"/>
         </w:rPr>
-        <w:t xml:space="preserve">Mesmo manual usado para classificar e para revisar. Desenho adequado para medir consistência entre rodadas, insuficiente para descobrir sozinho que uma regra está mal redigida — foi uma auditoria separada da redação que encontrou o primeiro achado.</w:t>
+        <w:t xml:space="preserve">Cobertura da leitura humana não uniforme entre planos. Trinta e três planos foram revisados por fila estratificada — temas raros e ambiguidades por inteiro, o restante por amostra, com erro residual estimado, não eliminado; o plano admitido por emenda teve todos os seus candidatos lidos um a um.</w:t>
       </w:r>
     </w:p>
     <w:p>
@@ -6860,7 +7121,7 @@
           <w:sz w:val="21"/>
           <w:szCs w:val="21"/>
         </w:rPr>
-        <w:t xml:space="preserve">Cobertura da leitura humana não uniforme entre planos. Trinta e três planos foram revisados por fila estratificada — temas raros e ambiguidades por inteiro, o restante por amostra, com erro residual estimado, não eliminado; o plano admitido por emenda teve todos os seus candidatos lidos um a um.</w:t>
+        <w:t xml:space="preserve">Cobertura do dicionário medida, não perfeita: recall de 93% no teste de padrão-ouro. Uma fração pequena de conteúdo relevante, escrito de forma que o vocabulário ainda não prevê, pode ficar de fora sem aparecer como ausência declarada.</w:t>
       </w:r>
     </w:p>
     <w:p>
@@ -6892,7 +7153,7 @@
           <w:sz w:val="21"/>
           <w:szCs w:val="21"/>
         </w:rPr>
-        <w:t xml:space="preserve">Cobertura do dicionário medida, não perfeita: recall de 93% no teste de padrão-ouro. Uma fração pequena de conteúdo relevante, escrito de forma que o vocabulário ainda não prevê, pode ficar de fora sem aparecer como ausência declarada.</w:t>
+        <w:t xml:space="preserve">A página indicada é onde a passagem aparece, não necessariamente a única em que aparece: alguns planos repetem o mesmo bloco de texto em mais de uma página.</w:t>
       </w:r>
     </w:p>
     <w:p>
@@ -6924,7 +7185,7 @@
           <w:sz w:val="21"/>
           <w:szCs w:val="21"/>
         </w:rPr>
-        <w:t xml:space="preserve">A página indicada é onde a passagem aparece, não necessariamente a única em que aparece (achado 2).</w:t>
+        <w:t xml:space="preserve">Natureza é o atributo mais frágil (93% de concordância entre rodadas), principalmente na fronteira entre Compromisso e Citação.</w:t>
       </w:r>
     </w:p>
     <w:p>
@@ -6956,7 +7217,7 @@
           <w:sz w:val="21"/>
           <w:szCs w:val="21"/>
         </w:rPr>
-        <w:t xml:space="preserve">Natureza é o atributo mais frágil (93% de concordância entre rodadas), principalmente na fronteira entre Compromisso e Citação.</w:t>
+        <w:t xml:space="preserve">Nível atribuído na pré-classificação e reconferido uma vez. A marcação de nível foi feita pela classificação assistida e reconferida sobre o registro completo, com critério escrito e leitura caso a caso dos limítrofes. Os seis trechos com meta quantificada foram lidos individualmente sob esse critério; a leitura está registrada na base, com os doze casos limítrofes mantidos fora e seus motivos.</w:t>
       </w:r>
     </w:p>
     <w:p>
@@ -6980,15 +7241,15 @@
       <w:r>
         <w:rPr>
           <w:rFonts w:ascii="Calibri" w:cs="Calibri" w:eastAsia="Calibri" w:hAnsi="Calibri"/>
-          <w:b/>
-          <w:bCs/>
-          <w:i w:val="false"/>
-          <w:iCs w:val="false"/>
-          <w:color w:val="000000"/>
-          <w:sz w:val="21"/>
-          <w:szCs w:val="21"/>
-        </w:rPr>
-        <w:t xml:space="preserve">Nível atribuído na pré-classificação e reconferido uma vez. A marcação de nível foi feita pela classificação assistida em setembro e revista em 26 de setembro, sobre os 827 trechos, com critério escrito e leitura caso a caso dos limítrofes. Nenhum dos seis trechos com meta quantificada passou por leitura humana individual na rodada de setembro; a leitura é de 26 de setembro, com critério escrito, e está registrada na base, com os doze casos limítrofes mantidos fora e seus motivos.</w:t>
+          <w:b w:val="false"/>
+          <w:bCs w:val="false"/>
+          <w:i w:val="false"/>
+          <w:iCs w:val="false"/>
+          <w:color w:val="000000"/>
+          <w:sz w:val="21"/>
+          <w:szCs w:val="21"/>
+        </w:rPr>
+        <w:t xml:space="preserve">Um parágrafo pode ser recuperado mais de uma vez. O registro conta ocorrências de termos do dicionário, não passagens: os 815 trechos correspondem a 660 parágrafos distintos, contados por igualdade exata do texto, e 200 trechos dividem parágrafo com ao menos um outro. Dezenove desses parágrafos carregam mais de um tema e 22, mais de uma natureza. Pares quase idênticos — o mesmo corpo com e sem o título — contam como parágrafos distintos. Somar trechos de dois temas pode, portanto, contar o mesmo parágrafo duas vezes.</w:t>
       </w:r>
     </w:p>
     <w:p>
@@ -7012,15 +7273,15 @@
       <w:r>
         <w:rPr>
           <w:rFonts w:ascii="Calibri" w:cs="Calibri" w:eastAsia="Calibri" w:hAnsi="Calibri"/>
-          <w:b/>
-          <w:bCs/>
-          <w:i w:val="false"/>
-          <w:iCs w:val="false"/>
-          <w:color w:val="000000"/>
-          <w:sz w:val="21"/>
-          <w:szCs w:val="21"/>
-        </w:rPr>
-        <w:t xml:space="preserve">Um parágrafo pode ser recuperado mais de uma vez. O registro conta ocorrências de termos do dicionário, não passagens: os 827 trechos correspondem a 664 parágrafos distintos, contados por igualdade exata do texto, e 211 trechos dividem parágrafo com ao menos um outro. Vinte e um desses parágrafos carregam mais de um tema e 24, mais de uma natureza. Pares quase idênticos — o mesmo corpo com e sem o título — contam como parágrafos distintos. Somar trechos de dois temas pode, portanto, contar o mesmo parágrafo duas vezes.</w:t>
+          <w:b w:val="false"/>
+          <w:bCs w:val="false"/>
+          <w:i w:val="false"/>
+          <w:iCs w:val="false"/>
+          <w:color w:val="000000"/>
+          <w:sz w:val="21"/>
+          <w:szCs w:val="21"/>
+        </w:rPr>
+        <w:t xml:space="preserve">Dois termos no mesmo parágrafo. A unidade de registro é a ocorrência de um termo: quando a reconstrução em parágrafo fez dois termos do dicionário passarem a dividir a mesma passagem, cada ocorrência permaneceu um trecho próprio, com destaque e classificação próprios — a expansão muda o que se exibe, não o que se conta, e a porta de identidade da ocorrência impede que o destaque migre para outra ocorrência do mesmo termo. O juízo é por quase-sentença: termos na mesma frase devem convergir em tema e natureza, e as divergências encontradas foram tratadas como inconsistência, com leitura integral dos parágrafos que combinam mais de um tema ou Citação com Compromisso e decisão registrada na base de dados publicada; termos em quase-sentenças diferentes do mesmo parágrafo podem divergir legitimamente, inclusive entre temas — o caso dos parágrafos multi-tema contados acima. Ocorrência de termo que passou a aparecer dentro de um parágrafo expandido sem ter trecho próprio não gera trecho nem destaque: a seleção do registro é fechada. O termo acrescentado em versão posterior do dicionário que cai dentro de trecho já registrado é tratado pela regra de expansão (seção 3): entra como termo adicional do mesmo trecho, sem criar trecho novo.</w:t>
       </w:r>
     </w:p>
     <w:p>
@@ -7092,7 +7353,7 @@
           <w:sz w:val="21"/>
           <w:szCs w:val="21"/>
         </w:rPr>
-        <w:t xml:space="preserve">Um pesquisador externo, com o corpus (manifesto com SHA-256 de cada PDF), o dicionário público e versionado, o manual de codificação e os scripts de varredura e extração, deve poder reproduzir o registro. Acompanham este documento: o manifesto do corpus de 22/09/2026 (37 arquivos, hashes, páginas), o registro do plano incluído por emenda, a lista dos 41 termos sem ocorrência, com o critério de contagem e as duas apurações lado a lado, a base de dados tabular que alimenta o site — com o texto em parágrafo de cada trecho, as posições do termo dentro dele e a impressão digital (código SHA-256) do arquivo de origem — e a lista de expressões usada na busca por linguagem contrária à agenda climática. O manual de codificação e o changelog do dicionário acompanham cada versão.</w:t>
+        <w:t xml:space="preserve">Um pesquisador externo, com o corpus (manifesto com SHA-256 de cada PDF), o dicionário público e versionado, o manual de codificação e os scripts de varredura e extração, deve poder reproduzir o registro. Acompanham este documento: o manifesto do corpus de 22/09/2026 (37 arquivos, hashes, páginas), o registro do plano incluído por emenda, a lista dos 41 termos sem ocorrência, com o critério de contagem e as duas apurações lado a lado, a base de dados tabular que alimenta o site — com o texto de cada trecho, as posições do termo dentro dele, as menções desconsideradas na validação — marcadas, não apagadas — e a impressão digital (código SHA-256) do arquivo de origem — e a lista de expressões usada na busca por linguagem contrária à agenda climática. O manual de codificação e o changelog do dicionário acompanham cada versão.</w:t>
       </w:r>
     </w:p>
     <w:p>
@@ -7776,7 +8037,7 @@
         <w:sz w:val="16"/>
         <w:szCs w:val="16"/>
       </w:rPr>
-      <w:t xml:space="preserve">Metodologia Completa v5.0 · Futura Evidence Lab · 26/09/2026  ·  </w:t>
+      <w:t xml:space="preserve">Metodologia Completa · 28/09/2026  ·  </w:t>
     </w:r>
     <w:r>
       <w:rPr>

</xml_diff>